<commit_message>
Korean master: same green-device wording; copula typo from the reflector replacement fixed
Co-Authored-By: Claude Fable 5.1 <noreply@anthropic.com>
Claude-Session: https://claude.ai/code/session_01A1WQ3WGcJw8tT3QK2n57xo
</commit_message>
<xml_diff>
--- a/manuscript/unityEQE_v26_ko.docx
+++ b/manuscript/unityEQE_v26_ko.docx
@@ -323,7 +323,7 @@
         <w:rPr>
           <w:b w:val="0"/>
         </w:rPr>
-        <w:t>전하수송층이 가시광선 대역에서 투명하고 금속 전극의 Joule dissipation loss를 두꺼운 Ag 전극으로 최소화하면, 투명 전극의 흡수만이 소자 내 주요 기생 흡수 경로로 남는다. 이 때문에 일반적인 OLED와는 다른 설계 규칙이 적용된다. 앞서 언급한 λ/4, λ/2 두께의 ITO나, 전면발광 OLED(TEOLED)에서 capping layer의 광학 물성을 고려해 투과도를 높이기 위해 쓰던 thin metal 전극은 모두 공진과 투과를 위한 선택이었지만, 본 연구에서는 흡수 경로를 최소화하기 위해 전기 전도도가 보장되는 최소한의 두께인 50 nm의 ITO 또는 10 nm의 Ag를 가정한다. 안정적인 동작에 필요한 면저항을 확보하려면 투명 전극의 흡수를 완전히 없앨 수는 없기에, 이상적인 투명 전극에 최대한 가깝게 구현하는 것이 핵심이 된다. 투명 전극에서는 유전율 허수부 ε₂ = 2nk에 비례하는 소산이 발생하는데, ITO와 같은 TCO는 n값은 크게 변하지 않지만 k값이 공정 조건에 따라 크게 변하고, thin metal 가운데 흡수가 가장 낮은 Ag는 k값은 크게 변하지 않지만 n값이 seed layer나 다른 금속과의 공증착 같은 공정 조건에 따라 크게 변한다.</w:t>
+        <w:t>전하수송층이 가시광선 대역에서 투명하고 금속 전극의 Joule dissipation loss를 두꺼운 Ag 전극으로 최소화하면, 투명 전극의 흡수만이 소자 내 주요 기생 흡수 경로로 남는다. 이 때문에 일반적인 OLED와는 다른 설계 규칙이 적용된다. 앞서 언급한 λ/4, λ/2 두께의 ITO나, 전면발광 OLED(TEOLED)에서 capping layer의 광학 물성을 고려해 투과도를 높이기 위해 쓰던 thin metal 전극은 모두 공진과 투과를 위한 선택이었지만, 본 연구에서는 흡수 경로를 최소화하기 위해 전기 전도도가 보장되는 최소한의 두께인 50 nm의 ITO 또는 10 nm의 Ag를 가정한다. 안정적인 동작에 필요한 면저항을 확보하려면 투명 전극의 흡수를 완전히 없앨 수는 없기에, 이상적인 투명 전극에 최대한 가깝게 구현하는 것이 핵심이 된다. 투명 전극에서는 유전율 허수부 ε₂ = 2nk(ε = ε₁ + iε₂)에 비례하는 소산이 발생하는데, ITO와 같은 TCO는 n값은 크게 변하지 않지만 k값이 공정 조건에 따라 크게 변하고, thin metal 가운데 흡수가 가장 낮은 Ag는 k값은 크게 변하지 않지만 n값이 seed layer나 다른 금속과의 공증착 같은 공정 조건에 따라 크게 변한다.</w:t>
       </w:r>
     </w:p>
     <w:p/>
@@ -403,16 +403,16 @@
         <w:rPr>
           <w:b w:val="0"/>
         </w:rPr>
-        <w:t>본 연구에서 제안하는 광학 설계의 핵심, 즉 왕복 손실을 줄이면 기판에 도달한 빛이 거의 전부 출광된다는 식 (3)의 타당성을 검증하기 위한 실험 결과는 그림 4와 같다. 두 소자 모두에서 저손실 반사체는 전극이 아니라 완성된 소자의 후면을 덮는 보조 반사체로, 전류 경로 밖에 놓인다. 따라서 이 실험은 전극 통합형 설계 자체가 아니라 그 바탕이 되는 다중 통과 추출 법칙을 검증하는 것이며, 보다 안정적인 전기적 구동과 효과적인 전하 주입을 위해 green 소자의 투명 전극 두께(150 nm ITO)와 n형 도펀트 추가 등에서는 앞 절의 설계 규칙보다 전기적 요구를 우선하였다.</w:t>
-      </w:r>
-    </w:p>
-    <w:p/>
-    <w:p>
-      <w:r>
-        <w:rPr>
-          <w:b w:val="0"/>
-        </w:rPr>
-        <w:t>첫 번째는 일반적인 굴절률의 유리 기판과 microlens array film 위에 제작한 green 인광 OLED이다(그림 4(a)). 소자 위의 thin film encapsulation과 Parylene-C 층은 상부 Ag 막을 하부 전극과 전기적으로 분리하여 반사체 역할만 하도록 설계하였다. 최대 EQE는 20%에서 55.8%로 2.8배 향상되었으며, 시뮬레이션으로 계산한 기판 전달 효율 η_sub가 60.9%이므로 기판에 도달한 빛의 91.6%가 출광된 것에 해당한다(방출량은 실측, η_sub는 모델 값; Methods). 이는 통상적인 굴절률의 상용 microlens film으로 얻은 값이며, 통합 모델이 예측한 최대 EQE 55.9%와 0.1%p 이내로 일치한다.</w:t>
+        <w:t>본 연구에서 제안하는 광학 설계의 핵심, 즉 왕복 손실을 줄이면 기판에 도달한 빛이 거의 전부 출광된다는 식 (3)의 타당성을 검증하기 위한 실험 결과는 그림 4와 같다. green 소자에서는 100 nm Ag 음극 자체가 저손실 반사체이며, 음극이 발광 면적만 덮는 반면 빛은 기판과 microlens film 안에서 옆으로 퍼지므로 발광 면적보다 넓은 Ag 막을 봉지층 위에 소자와 전기적으로 분리하여 추가로 증착해 옆으로 퍼진 빛도 저손실 반사체를 만나게 하였다. orange 소자에서는 완성된 소자의 후면에 둔 dielectric 보조 반사체가 저손실 반사체이며 전류 경로 밖에 놓인다. 이 실험은 완전히 최적화된 전극 통합형 설계가 아니라 그 바탕이 되는 다중 통과 추출 법칙을 검증하는 것이며, 보다 안정적인 전기적 구동과 효과적인 전하 주입을 위해 green 소자의 투명 전극 두께(150 nm ITO)와 n형 도펀트 추가 등에서는 앞 절의 설계 규칙보다 전기적 요구를 우선하였다.</w:t>
+      </w:r>
+    </w:p>
+    <w:p/>
+    <w:p>
+      <w:r>
+        <w:rPr>
+          <w:b w:val="0"/>
+        </w:rPr>
+        <w:t>첫 번째는 일반적인 굴절률의 유리 기판과 microlens array film 위에 제작한 green 인광 OLED이다(그림 4(a)). thin film encapsulation과 Parylene-C 층은 추가 Ag 막을 전극과 전기적으로 분리하여 반사체 역할만 하도록 한다. 최대 EQE는 20%에서 55.8%로 2.8배 향상되었으며, 시뮬레이션으로 계산한 기판 전달 효율 η_sub가 60.9%이므로 기판에 도달한 빛의 91.6%가 출광된 것에 해당한다(방출량은 실측, η_sub는 모델 값; Methods). 이는 통상적인 굴절률의 상용 microlens film으로 얻은 값이며, 통합 모델이 예측한 최대 EQE 55.9%와 0.1%p 이내로 일치한다.</w:t>
       </w:r>
     </w:p>
     <w:p/>
@@ -483,7 +483,7 @@
         <w:rPr>
           <w:b w:val="0"/>
         </w:rPr>
-        <w:t>본 연구에서는 외부 광추출 구조가 적용된 OLED의 광추출을 다중 통과 추출 법칙으로 기술하고 손실 경로를 정량적으로 추적하여, 왕복 손실을 결정하는 소자 내부의 기생 흡수가 최종 효율을 지배한다는 것을 밝히고 이를 최소화하는 새로운 설계 규칙을 제안하였다. 통상적인 굴절률의 기판 위에서 Ag 보조 반사체로 기판에 도달한 빛의 91.6%를 출광시킬 수 있음을 실측으로 확인하였고, 고굴절 광추출 기판 위에서는 dielectric 보조 반사체로 77%의 EQE를 달성하였으며, 전극 통합형 구조에서 등방성 발광체로도 80% 후반, 흡수가 더 작은 투명 전극으로는 90%에 이르는 EQE의 경로를 제시하였으며, 이 경로는 발광체의 배향(Θ = 0.67–0.9)에 거의 무관하다. 법칙이 요구하는 것은 왕복 손실이 수 % 이내라는 조건뿐이므로 반사체의 종류는 설계 변수이지 전제가 아니며, 이 설계 규칙은 발광체의 배향과 마이크로캐비티로 대변되는 기존 설계 제약에서 벗어난 높은 설계 자유도를 가지고, 광추출 구조의 형상과 산란 특성에 대해서도 넓은 허용 범위를 가져 다양한 광추출 구조와 공정에 적용될 수 있다. 본 실험의 보조 반사체는 추출을 위해 소자 바깥에 추가 공간을 필요로 하므로, 디스플레이 화소에는 저손실 반사체를 전극에 통합한 구조가 요구된다. 이는 TEOLED에서 thin Ag 또는 저손상 산화물 투명 전극의 흡수를 낮추는 문제로 귀결되며, 같은 원리는 QLED, PeLED 등 다른 박막 발광 소자에도 그대로 적용되어 새로운 박막 LED 광학 설계 플랫폼이 될 수 있을 것으로 전망한다.</w:t>
+        <w:t>본 연구에서는 외부 광추출 구조가 적용된 OLED의 광추출을 다중 통과 추출 법칙으로 기술하고 손실 경로를 정량적으로 추적하여, 왕복 손실을 결정하는 소자 내부의 기생 흡수가 최종 효율을 지배한다는 것을 밝히고 이를 최소화하는 새로운 설계 규칙을 제안하였다. 통상적인 굴절률의 기판 위에서 저손실 Ag 반사체로 기판에 도달한 빛의 91.6%를 출광시킬 수 있음을 실측으로 확인하였고, 고굴절 광추출 기판 위에서는 dielectric 보조 반사체로 77%의 EQE를 달성하였으며, 전극 통합형 구조에서 등방성 발광체로도 80% 후반, 흡수가 더 작은 투명 전극으로는 90%에 이르는 EQE의 경로를 제시하였으며, 이 경로는 발광체의 배향(Θ = 0.67–0.9)에 거의 무관하다. 법칙이 요구하는 것은 왕복 손실이 수 % 이내라는 조건뿐이므로 반사체의 종류는 설계 변수이지 전제가 아니며, 이 설계 규칙은 발광체의 배향과 마이크로캐비티로 대변되는 기존 설계 제약에서 벗어난 높은 설계 자유도를 가지고, 광추출 구조의 형상과 산란 특성에 대해서도 넓은 허용 범위를 가져 다양한 광추출 구조와 공정에 적용될 수 있다. 본 실험의 보조 반사체는 추출을 위해 소자 바깥에 추가 공간을 필요로 하므로, 디스플레이 화소에는 저손실 반사체를 전극에 통합한 구조가 요구된다. 이는 TEOLED에서 thin Ag 또는 저손상 산화물 투명 전극의 흡수를 낮추는 문제로 귀결되며, 같은 원리는 QLED, PeLED 등 다른 박막 발광 소자에도 그대로 적용되어 새로운 박막 LED 광학 설계 플랫폼이 될 수 있을 것으로 전망한다.</w:t>
       </w:r>
     </w:p>
     <w:p/>
@@ -815,7 +815,7 @@
         <w:rPr>
           <w:b w:val="0"/>
         </w:rPr>
-        <w:t xml:space="preserve"> (a) 유리 기판과 microlens array film 위에 제작하고 봉지층 위에 Ag 보조 반사체를 둔 green 인광 OLED의 소자 구조, J–V–L 및 L–EQE 특성(최대 EQE 20% → 55.8%). (b) microlens array가 형성된 고굴절 기판(n = 1.77) 위에 제작하고 후면에 ZnS/LiF DBR을 둔 orange 인광 OLED의 소자 구조, J–V–L 및 L–EQE 특성(기준 소자 23%, microlens array 기판 + Al 61%, microlens array 기판 + Al + DBR 77%). DBR은 ZnS/LiF alternating layer 4.5 stack으로 구성되며, 각 층의 두께는 genetic algorithm으로 최적화하였다. 두 소자 모두 반사체는 전류 경로 밖의 보조 반사체가다.</w:t>
+        <w:t xml:space="preserve"> (a) 유리 기판과 microlens array film 위에 제작하고 100 nm Ag 음극을 저손실 반사체로, 봉지층 위에 발광 면적보다 넓은 Ag 막을 추가로 둔 green 인광 OLED의 소자 구조, J–V–L 및 L–EQE 특성(최대 EQE 20% → 55.8%). (b) microlens array가 형성된 고굴절 기판(n = 1.77) 위에 제작하고 후면에 ZnS/LiF DBR을 둔 orange 인광 OLED의 소자 구조, J–V–L 및 L–EQE 특성(기준 소자 23%, microlens array 기판 + Al 61%, microlens array 기판 + Al + DBR 77%). DBR은 ZnS/LiF alternating layer 4.5 stack으로 구성되며, 각 층의 두께는 genetic algorithm으로 최적화하였다. (b)의 DBR은 전류 경로 밖의 보조 반사체이고, (a)의 추가 Ag 막은 소자와 전기적으로 분리되어 있다.</w:t>
       </w:r>
     </w:p>
     <w:p/>

</xml_diff>